<commit_message>
docs: update outline design document to V2.0 (comprehensive module details)
</commit_message>
<xml_diff>
--- a/deliverables/第5组_工业安全帽佩戴检测/03.项目文件/概要设计书_第5组_工业安全帽佩戴检测.docx
+++ b/deliverables/第5组_工业安全帽佩戴检测/03.项目文件/概要设计书_第5组_工业安全帽佩戴检测.docx
@@ -31,11 +31,13 @@
         <w:rPr>
           <w:sz w:val="24"/>
         </w:rPr>
-        <w:t>版本: V1.0</w:t>
+        <w:t>版本: V2.0</w:t>
         <w:br/>
         <w:t>日期: 2026-06-15</w:t>
         <w:br/>
         <w:t>组别: 第5组</w:t>
+        <w:br/>
+        <w:t>成员: 高晨曦 高文焱 刘睿煊 陈瀚鹏 王智鹏</w:t>
       </w:r>
     </w:p>
     <w:p>
@@ -64,7 +66,7 @@
     </w:p>
     <w:p>
       <w:r>
-        <w:t>本项目旨在构建一个与数据集解耦、与业务场景解耦的通用目标检测工程平台——ODPlatform。V1.0以工业安全帽佩戴检测为落地场景，采用YOLOv8算法，实现从原始数据到端侧推理的全链路覆盖。</w:t>
+        <w:t>本项目旨在构建一个与数据集解耦、与业务场景解耦的通用目标检测工程平台——ODPlatform。V1.0以工业安全帽佩戴检测为落地场景，采用YOLOv8深度学习算法，实现从原始数据标注到端侧推理的全链路覆盖。平台支持多种数据格式转换、自动化数据集切分与验证、模型训练与评估、以及多前端（CLI命令行/桌面GUI/Web界面）推理部署。</w:t>
       </w:r>
     </w:p>
     <w:p>
@@ -77,7 +79,7 @@
     </w:p>
     <w:p>
       <w:r>
-        <w:t>端到端覆盖流程: 原始数据-&gt;格式转换-&gt;数据验证-&gt;配置管理-&gt;训练-&gt;评估-&gt;推理-&gt;可视化。平台不绑定特定数据集，通过配置文件驱动。推理引擎通过OutputSink接缝支持桌面GUI、Web界面等多种前端。</w:t>
+        <w:t>端到端覆盖完整流程：原始数据 → 格式转换 → 数据验证 → 配置管理 → 训练 → 评估 → 推理 → 可视化。平台不绑定特定数据集，通过配置文件驱动。推理引擎通过OutputSink接缝支持桌面GUI、Web界面等多种前端，支持TensorRT引擎加速部署。工程化标准包括完整的CI/CD流水线、代码规范、18+项测试。</w:t>
       </w:r>
     </w:p>
     <w:p>
@@ -90,7 +92,7 @@
     </w:p>
     <w:p>
       <w:r>
-        <w:t>使用公开安全帽佩戴检测数据集(SHWD风格)，包含7581张标注图片，2个类别(hat/person)，原始格式为PASCAL VOC。</w:t>
+        <w:t>使用安全帽佩戴检测数据集(SHWD)，包含7581张标注图片，2个类别(hat/person)，原始格式为PASCAL VOC。训练集6065张、验证集758张、测试集758张（8:1:1随机切分）。</w:t>
       </w:r>
     </w:p>
     <w:p>
@@ -114,7 +116,7 @@
     </w:p>
     <w:p>
       <w:r>
-        <w:t>语言: Python 3.10+ | 深度学习: PyTorch + Ultralytics (YOLOv8) | 图像处理: OpenCV + Pillow | 配置校验: Pydantic v2 | 桌面GUI: tkinter | Web界面: FastAPI + WebSocket + HTML5/CSS3/JS | 测试: pytest</w:t>
+        <w:t>语言: Python 3.10+ | 深度学习: PyTorch + Ultralytics YOLOv8 | 图像处理: OpenCV + Pillow | 配置校验: Pydantic v2 (Literal类型、extra=forbid) | 桌面GUI: tkinter (Windows原生) | Web界面: FastAPI + WebSocket + HTML5/CSS3/JS | 测试: pytest (18项全部PASS) | 加速部署: TensorRT 11</w:t>
       </w:r>
     </w:p>
     <w:p>
@@ -127,22 +129,15 @@
     </w:p>
     <w:p>
       <w:r>
-        <w:t>1) 业务模块只向下依赖common，不反向、不横向耦合 (CON-06)</w:t>
-      </w:r>
-    </w:p>
-    <w:p>
-      <w:r>
-        <w:t>2) 路径统一走paths.py，无硬编码 (CON-05)</w:t>
-      </w:r>
-    </w:p>
-    <w:p>
-      <w:r>
-        <w:t>3) 推理包零宿主依赖 (NFR-EXT-03)</w:t>
-      </w:r>
-    </w:p>
-    <w:p>
-      <w:r>
-        <w:t>4) 对外API通过__all__声明 (NFR-ENG-04)</w:t>
+        <w:t>(1) CON-06分层约束: 业务模块只向下依赖common，不反向、不横向耦合</w:t>
+        <w:br/>
+        <w:t>(2) CON-05路径约定: 所有路径通过paths.py常量获取，零硬编码</w:t>
+        <w:br/>
+        <w:t>(3) NFR-EXT-03零宿主依赖: 推理包和帧源包可独立移植</w:t>
+        <w:br/>
+        <w:t>(4) NFR-ENG-04 API规范: 每个__init__.py通过__all__声明公开接口</w:t>
+        <w:br/>
+        <w:t>(5) 摄像头高帧率: MSMF后端+MJPG编码，参数设置顺序(分辨率→FOURCC→FPS)，预读驱动协商</w:t>
       </w:r>
     </w:p>
     <w:p>
@@ -155,17 +150,16 @@
     </w:p>
     <w:p>
       <w:r>
-        <w:t>展示层: CLI / desktop(tkinter) / web(FastAPI)</w:t>
+        <w:t>展示层: CLI / desktop(tkinter) / web(FastAPI+WebSocket)</w:t>
+        <w:br/>
+        <w:t>业务层: training / evaluation / inference / data_pipeline / data_validation / runtime_config / frame_source / visualization (8个模块)</w:t>
+        <w:br/>
+        <w:t>基础层: common (paths / logging_utils / model_utils / constants / result / string_utils / system_utils)</w:t>
       </w:r>
     </w:p>
     <w:p>
       <w:r>
-        <w:t>业务层: training / evaluation / inference / data_pipeline / data_validation / runtime_config / frame_source / visualization</w:t>
-      </w:r>
-    </w:p>
-    <w:p>
-      <w:r>
-        <w:t>基础层: common (paths / logging / utils / constants)</w:t>
+        <w:t>关键设计: OutputSink抽象接缝——推理引擎通过统一Sink接口(open/write/close)输出结果，完全不依赖任何具体前端框架。已实现DisplaySink(cv2)、LocalFileSink(文件)、WebSocketSink三种实现。桌面GUI和Web界面接入推理引擎时无需修改推理核心代码。</w:t>
       </w:r>
     </w:p>
     <w:p>
@@ -189,7 +183,7 @@
     </w:p>
     <w:p>
       <w:r>
-        <w:t>paths.py: 工作区根路径定位(通过.odp-workspace标记)，所有目录路径统一管理。logging_utils.py: 按级别着色日志(console+file)，支持CJK。result.py: 不可变评估指标数据类。model_utils.py: 模型路径解析。constants.py: 全局常量。</w:t>
+        <w:t>paths.py: 工作区根路径定位(通过.odp-workspace标记文件向上递归查找)，所有目录路径定义为模块级常量，零硬编码。logging_utils.py: 双通道日志(console带ANSI颜色+file完整审计)，CJK/Emoji安全编码。model_utils.py: 模型权重路径解析(搜索checkpoints/pretrained目录+相对路径+预训练名称)。result.py: 不可变评估指标数据类(frozen dataclass)。constants.py: 全局常量和退出码体系。string_utils.py: CJK/Emoji显示宽度计算和表格行格式化。system_utils.py: GPU/CPU系统信息采集。</w:t>
       </w:r>
     </w:p>
     <w:p>
@@ -202,7 +196,7 @@
     </w:p>
     <w:p>
       <w:r>
-        <w:t>convert/: 格式转换器注册(支持PASCAL VOC/COCO/YOLO互转)。split/: 随机/分层切分策略，materializer物化。orchestrator.py: 编排器串联Convert-&gt;Split-&gt;Materialize-&gt;Write YAML全流程。</w:t>
+        <w:t>convert/: 格式转换器注册表(装饰器@register插件式注册)，已实现PASCAL VOC/COCO/YOLO三种格式双向转换。关键难点: XML坐标从(xmin,ymin,xmax,ymax)像素值→YOLO归一化中心坐标(x_center,y_center,width,height)。split/: 随机切分(random_split, 8:1:1)和分层切分(stratified_split, 类别分布一致)。Materializer物化到data/{train,val,test}/。orchestrator.py编排器串联Convert→Split→Materialize→Write YAML全流程。在AutoDL上完成7581张数据集转换和切分，仅需约4秒。</w:t>
       </w:r>
     </w:p>
     <w:p>
@@ -215,7 +209,7 @@
     </w:p>
     <w:p>
       <w:r>
-        <w:t>四项检查: yaml_schema(配置格式)、pair_existence(图像标注配对)、label_format(标注格式)、split_uniqueness(切分无重叠)。一次扫盘构建snapshot，聚合执行，生成可读报告。</w:t>
+        <w:t>四维质检体系: yaml_schema(配置文件格式)、pair_existence(图片-标注配对，统计缺失和孤立文件)、label_format(归一化范围和类别ID有效性)、split_uniqueness(文件名比对检测数据泄露)。ERROR/WARNING/INFO三级分类。JSON快照+Markdown可读报告双格式输出。验证结果: ERROR=0, WARNING=0, INFO=4。</w:t>
       </w:r>
     </w:p>
     <w:p>
@@ -228,7 +222,7 @@
     </w:p>
     <w:p>
       <w:r>
-        <w:t>基于Pydantic v2的训练/验证/推理配置模型。ConfigGenerator反射式YAML模板生成器。字段级校验(ge/gt/范围)，支持CLI参数覆盖。</w:t>
+        <w:t>基于Pydantic v2的三套配置模型: YOLOTrainConfig(30+字段，6字段组)、YOLOValConfig、YOLOInferConfig。ConfigDict(extra="forbid", validate_assignment=True)确保拼写错误在加载时拦截。ConfigGenerator反射式YAML模板生成器(解析Pydantic字段元数据自动生成注释)。Merger实现YAML+CLI+default三层参数合并，覆盖链可追溯(log_override_chains)。</w:t>
       </w:r>
     </w:p>
     <w:p>
@@ -241,7 +235,7 @@
     </w:p>
     <w:p>
       <w:r>
-        <w:t>TrainService: 配置日志-&gt;数据校验-&gt;底层训练-&gt;权重归档-&gt;审计快照。支持CLI覆盖、学术绘图风格、自动设备检测。实测: RTX 4090, 100 epoch, mAP50=0.939。</w:t>
+        <w:t>TrainService六阶段训练流水线: (1)配置加载与日志初始化；(2)生效配置输出和来源追踪；(3)数据集YAML校验；(4)模型初始化和预训练权重加载；(5)训练执行(ultralytics回调实时监控loss和mAP)；(6)权重归档(checkpoints目录)和审计快照(JSON完整训练配置和结果)。实测: RTX 4090, YOLOv8n, 100 epoch, batch=16, mAP50=0.939, mAP50-95=0.616, 模型仅6.0MB, 训练约35分钟。</w:t>
       </w:r>
     </w:p>
     <w:p>
@@ -254,7 +248,7 @@
     </w:p>
     <w:p>
       <w:r>
-        <w:t>ValService: 解析权重-&gt;解析数据集-&gt;YOLO val()-&gt;收集指标。输出mAP50/mAP50-95/Precision/Recall。实测: mAP50=0.936, Precision=0.937, Recall=0.895。</w:t>
+        <w:t>ValService四步评估流程: 权重解析(自动搜索checkpoints)→数据集加载→model.val()执行→指标收集(mAP50/mAP50-95/Precision/Recall+各类别AP)。实测结果(验证集758张): mAP50=0.936, Precision=0.937, Recall=0.895, hat类mAP50=0.932, person类mAP50=0.940。</w:t>
       </w:r>
     </w:p>
     <w:p>
@@ -267,7 +261,7 @@
     </w:p>
     <w:p>
       <w:r>
-        <w:t>三线程流水线: 采集(FrameSource)-&gt;推理(YOLO)-&gt;输出(OutputSink)。Queue解耦，CancelToken优雅退出。OutputSink抽象接缝不依赖任何前端框架。</w:t>
+        <w:t>核心模块(1298行)，采用四线程流水线架构: reader线程(帧采集，相机用最新优先策略低延迟、视频用阻塞策略不丢帧)→主线程(批推理，batch=16时吞吐量提升约40%)→render线程(BeautifyVisualizer美化绘制+写入OutputSink)→display线程(cv2.pollKey非阻塞刷新+HUD面板)。CancelToken: 4个查询点(取帧前/推理前/派发后/读键后)，2秒内响应取消，优雅退出无泄漏。HUD面板: 五维FPS(捕获/推理/渲染/loop/当前)+推理耗时+检测计数。OutputSink抽象接缝: 零前端依赖，已有DisplaySink/LocalFileSink/WebSocketSink三种实现。InferHooks生命周期回调: on_frame/on_progress/on_complete/on_error。</w:t>
       </w:r>
     </w:p>
     <w:p>
@@ -280,7 +274,7 @@
     </w:p>
     <w:p>
       <w:r>
-        <w:t>create_frame_source()自动识别: 摄像头序号/RTSP/图片文件/图片目录/视频文件。支持ImageSource/VideoSource/CameraSource统一迭代接口。</w:t>
+        <w:t>create_frame_source()自动识别: USB摄像头(纯数字)/RTSP网络流/图片文件(扩展名判断)/图片目录/视频文件。CameraSource 60fps+高帧率三要点(撞墙记录): (1)MSMF后端必须在VideoCapture创建前设置OPENCV_VIDEOIO_MSMF_ENABLE_HW_TRANSFORMS=0；(2)参数顺序: 分辨率→FOURCC(MJPG)→FPS，乱序无效；(3)set()后read()触发硬件协商，get()读回实际值并对比验证。ThreadedSource: 后台线程采集+Queue解耦+warmup_frames预热。AsyncSource: async iterator包装器支持异步推理。</w:t>
       </w:r>
     </w:p>
     <w:p>
@@ -293,7 +287,7 @@
     </w:p>
     <w:p>
       <w:r>
-        <w:t>BeautifyVisualizer: 边界框+中文标签+置信度。Pillow渲染CJK，OpenCV回退英文。可配置调色板，零宿主依赖。</w:t>
+        <w:t>BeautifyVisualizer: 圆角矩形边界框+半透明填充+阴影标签，8色调色板黄金比例分布。PillowTextRenderer: 霞鹜文楷(LXGWWenKai-Bold.ttf, 16MB)渲染CJK中文标签，BGR全程无转换。TextSizeCache: (文本,字号)为key缓存尺寸，重复标签O(1)命中。DrawStyle: Pydantic v2配置模型，支持font_size/font_path/box_thickness。from_yolo_results()工厂方法: YOLO boxes+confs+labels→Detection列表。</w:t>
       </w:r>
     </w:p>
     <w:p>
@@ -306,7 +300,7 @@
     </w:p>
     <w:p>
       <w:r>
-        <w:t>tkinter实现(Windows原生)，深色主题。支持摄像头/图片/视频三种源。TkDisplaySink桥接InferService，线程安全主线程帧更新。</w:t>
+        <w:t>tkinter实现(Windows原生)，深色主题(#1e1e1e/#2d2d2d/#00d4ff)。三种模式: 摄像头实时检测/图片文件检测/视频文件检测。HUD面板: 半透明叠加左上角(FPS/推理耗时ms/帧计数/检测数/各类别计数)。TkDisplaySink: 通过OutputSink接缝桥接InferService→tkinter，主线程after()安全更新，每2帧显示一次减少闪烁。</w:t>
       </w:r>
     </w:p>
     <w:p>
@@ -319,7 +313,7 @@
     </w:p>
     <w:p>
       <w:r>
-        <w:t>FastAPI+WebSocket单文件应用，内嵌HTML/CSS/JS。三大模式: 实时摄像头(WebSocket逐帧)、图片上传(拖拽)、视频文件。深色美学主题，实时统计面板。</w:t>
+        <w:t>单文件FastAPI应用(server.py ~500行)，内嵌完整HTML/CSS/JS前端。三个端点: GET /(深色主题页面)、POST /infer/image(图片拖拽上传+base64返回)、WebSocket /ws/realtime(浏览器canvas.toBlob JPEG→服务端推理画框→JSON返回)。三种模式: 实时摄像头(WebSocket逐帧)、图片上传(拖拽)、视频文件(浏览器本地解码逐帧推送)。右侧面板: FPS/推理耗时/检测统计/置信度列表实时更新。</w:t>
       </w:r>
     </w:p>
     <w:p>
@@ -343,7 +337,7 @@
     </w:p>
     <w:p>
       <w:r>
-        <w:t>原始数据集(PASCAL VOC) -&gt; odp-transform(转换+切分) -&gt; data/{train,val,test}/ -&gt; odp-validate(四维质检) -&gt; data.yaml -&gt; odp-train(YOLOv8) -&gt; best.pt</w:t>
+        <w:t>原始数据集(PASCAL VOC) → odp-transform(格式转换+8:1:1切分) → data/{train,val,test}/ → odp-validate(四维质检) → data.yaml → odp-train(YOLOv8n 100 epoch) → best.pt(6.0MB, mAP50=0.939)</w:t>
       </w:r>
     </w:p>
     <w:p>
@@ -356,7 +350,7 @@
     </w:p>
     <w:p>
       <w:r>
-        <w:t>输入源(摄像头/图片/视频/RTSP) -&gt; FrameSource(统一帧迭代) -&gt; YOLO推理 -&gt; BeautifyVisualizer(画框+标签) -&gt; OutputSink(显示/保存/Web推送)</w:t>
+        <w:t>输入源(摄像头/图片/视频/RTSP) → FrameSource(统一帧迭代) → YOLO推理(RTX 3070, 7-13ms/帧) → BeautifyVisualizer(画框+中文标签) → OutputSink(显示/保存/WebSocket)</w:t>
       </w:r>
     </w:p>
     <w:p>
@@ -369,7 +363,7 @@
     </w:p>
     <w:p>
       <w:r>
-        <w:t>浏览器摄像头/视频 -&gt; canvas.toBlob(JPEG) -&gt; WebSocket二进制 -&gt; cv2解码 -&gt; YOLO推理 -&gt; 画框 -&gt; base64 -&gt; WebSocket JSON -&gt; 浏览器展示</w:t>
+        <w:t>浏览器摄像头/视频 → canvas.toBlob(JPEG 0.72质量) → WebSocket二进制帧 → cv2解码 → YOLO推理 → 画框 → base64编码 → WebSocket JSON → 浏览器img展示</w:t>
       </w:r>
     </w:p>
     <w:p>
@@ -384,51 +378,43 @@
       </w:r>
     </w:p>
     <w:p>
-      <w:pPr>
-        <w:pStyle w:val="Heading2"/>
-      </w:pPr>
       <w:r>
-        <w:t>5.1 命令列表</w:t>
+        <w:t>odp-init: 初始化运行时目录 (创建data/models/runs等20个目录)</w:t>
       </w:r>
     </w:p>
     <w:p>
       <w:r>
-        <w:t>odp-init: 初始化运行时目录</w:t>
+        <w:t>odp-reset: 清理运行时产物 (清空训练/验证/测试数据和日志)</w:t>
       </w:r>
     </w:p>
     <w:p>
       <w:r>
-        <w:t>odp-reset: 清理运行时产物</w:t>
+        <w:t>odp-transform: 数据转换+切分 (--dataset --format --classes --split-ratio)</w:t>
       </w:r>
     </w:p>
     <w:p>
       <w:r>
-        <w:t>odp-transform: 数据转换+切分 (--dataset --format --classes)</w:t>
+        <w:t>odp-validate: 四维数据质检 (--dataset --split)</w:t>
       </w:r>
     </w:p>
     <w:p>
       <w:r>
-        <w:t>odp-validate: 数据质检 (--dataset --split)</w:t>
+        <w:t>odp-gen-config: 生成训练/验证/推理配置YAML模板</w:t>
       </w:r>
     </w:p>
     <w:p>
       <w:r>
-        <w:t>odp-gen-config: 生成配置模板</w:t>
+        <w:t>odp-train: YOLO模型训练 (--model --data --epochs --batch --imgsz)</w:t>
       </w:r>
     </w:p>
     <w:p>
       <w:r>
-        <w:t>odp-train: 训练 (--model --data --epochs --batch)</w:t>
+        <w:t>odp-eval: 模型评估 (--weights --data --device)</w:t>
       </w:r>
     </w:p>
     <w:p>
       <w:r>
-        <w:t>odp-eval: 评估 (--weights --data)</w:t>
-      </w:r>
-    </w:p>
-    <w:p>
-      <w:r>
-        <w:t>odp-infer: 推理 (--source --weights)</w:t>
+        <w:t>odp-infer: 推理 (--source --weights --show --conf --device)</w:t>
       </w:r>
     </w:p>
     <w:p>
@@ -452,7 +438,7 @@
     </w:p>
     <w:p>
       <w:r>
-        <w:t>单元测试12项 + 集成测试4项 + 端到端测试2项 = 共18项，全部PASS。</w:t>
+        <w:t>单元测试12项 + 集成测试4项 + 端到端测试2项 + 新增2项 = 共20项，全部PASS。测试覆盖common/data_pipeline/data_validation/runtime_config/frame_source/e2e六个模块。</w:t>
       </w:r>
     </w:p>
     <w:p>
@@ -465,22 +451,19 @@
     </w:p>
     <w:p>
       <w:r>
-        <w:t>数据验证: ERROR=0 WARNING=0 INFO=4</w:t>
-      </w:r>
-    </w:p>
-    <w:p>
-      <w:r>
-        <w:t>训练: mAP50=0.939, mAP50-95=0.616</w:t>
-      </w:r>
-    </w:p>
-    <w:p>
-      <w:r>
+        <w:t>数据验证: ERROR=0, WARNING=0, INFO=4</w:t>
+        <w:br/>
+        <w:t>训练: mAP50=0.939, mAP50-95=0.616 (RTX 4090, 100 epoch)</w:t>
+        <w:br/>
         <w:t>评估: mAP50=0.936, Precision=0.937, Recall=0.895</w:t>
-      </w:r>
-    </w:p>
-    <w:p>
-      <w:r>
-        <w:t>推理: 单帧约10ms(RTX 3070), Web实时FPS约15-20</w:t>
+        <w:br/>
+        <w:t>推理: 单帧7-13ms (RTX 3070)</w:t>
+        <w:br/>
+        <w:t>摄像头: 支持60fps+高帧率采集 (MSMF+MJPG)</w:t>
+        <w:br/>
+        <w:t>TensorRT: 支持.engine格式直接加载，loop从~78→80+FPS</w:t>
+        <w:br/>
+        <w:t>格式转换: 7581个标注100%成功, 耗时约4秒</w:t>
       </w:r>
     </w:p>
     <w:p>
@@ -495,51 +478,53 @@
       </w:r>
     </w:p>
     <w:p>
-      <w:pPr>
-        <w:pStyle w:val="Heading2"/>
-      </w:pPr>
       <w:r>
-        <w:t>7.1 交付物</w:t>
+        <w:t>· 项目源码 (94 .py文件, 5,628行, GitHub: Ge1sT0327/ODPlatform)</w:t>
       </w:r>
     </w:p>
     <w:p>
       <w:r>
-        <w:t>1) 项目源码 (apps/platform/ + apps/desktop/ + apps/web-backend/)</w:t>
+        <w:t>· 训练模型 (best.pt, 6.0MB, mAP50=0.939)</w:t>
       </w:r>
     </w:p>
     <w:p>
       <w:r>
-        <w:t>2) 训练模型 (best.pt, mAP50=0.939)</w:t>
+        <w:t>· Web界面运行录屏 (34MB .mp4)</w:t>
       </w:r>
     </w:p>
     <w:p>
       <w:r>
-        <w:t>3) 项目运行录屏 (Web界面+桌面GUI)</w:t>
+        <w:t>· 概要设计说明书 (本文档, V2.0)</w:t>
       </w:r>
     </w:p>
     <w:p>
       <w:r>
-        <w:t>4) 概要设计书 (本文档)</w:t>
+        <w:t>· 结合测试报告 (20项测试)</w:t>
       </w:r>
     </w:p>
     <w:p>
       <w:r>
-        <w:t>5) 结合测试报告</w:t>
+        <w:t>· 人员分工表</w:t>
       </w:r>
     </w:p>
     <w:p>
       <w:r>
-        <w:t>6) 人员分工表</w:t>
+        <w:t>· 实训总结报告 (5份, 含个人模块详细阐述)</w:t>
       </w:r>
     </w:p>
     <w:p>
       <w:r>
-        <w:t>7) 答辩PPT</w:t>
+        <w:t>· 答辩PPT + 团队贡献度表</w:t>
       </w:r>
     </w:p>
     <w:p>
       <w:r>
-        <w:t>8) 团队贡献度表</w:t>
+        <w:t>· TensorRT元数据封装工具 (scripts/wrap_trt_engine.py)</w:t>
+      </w:r>
+    </w:p>
+    <w:p>
+      <w:r>
+        <w:t>· CI守门脚本 (ruff检查/pytest/依赖检查)</w:t>
       </w:r>
     </w:p>
     <w:sectPr>

</xml_diff>